<commit_message>
Revert restyle, restore the original resume formatting
The previous pass replaced the resume's visual identity instead of
improving it. Reverted at Justin's request.

Restored exactly as supplied:
- One serif family throughout, not a Charter/sans pairing
- Navy uppercase headings over solid full-width navy rules, not fine
  slate rules with letterspacing
- Entry lines inline and left-aligned, pipe-separated, rather than dates
  pushed into a right-hand column
- Standard round bullets
- Original section order: Education, Additional Experience, then
  Certification In Progress

All content improvements from the earlier passes are kept, and the page
is back to 9.0pt on one page.

Co-Authored-By: Claude Opus 5 <noreply@anthropic.com>
Claude-Session: https://claude.ai/code/session_01CPAgs5RUyKxnQQzxn8sYKH
</commit_message>
<xml_diff>
--- a/resume/Mohsen_Fekri_EY_Resume_v2.docx
+++ b/resume/Mohsen_Fekri_EY_Resume_v2.docx
@@ -4,368 +4,267 @@
   <w:body>
     <w:p>
       <w:pPr>
-        <w:spacing w:after="50" w:before="0"/>
+        <w:spacing w:after="20" w:before="0"/>
         <w:jc w:val="center"/>
       </w:pPr>
       <w:r>
         <w:rPr>
-          <w:rFonts w:ascii="Calibri" w:hAnsi="Calibri"/>
           <w:b/>
           <w:i w:val="0"/>
           <w:color w:val="1F3B63"/>
-          <w:sz w:val="41"/>
-          <w:spacing w:val="40"/>
+          <w:sz w:val="38"/>
         </w:rPr>
         <w:t>MOHSEN FEKRI</w:t>
       </w:r>
     </w:p>
     <w:p>
       <w:pPr>
-        <w:spacing w:after="54" w:before="0"/>
+        <w:spacing w:after="40" w:before="0"/>
         <w:jc w:val="center"/>
       </w:pPr>
       <w:r>
         <w:rPr>
-          <w:rFonts w:ascii="Calibri" w:hAnsi="Calibri"/>
-          <w:b w:val="0"/>
+          <w:b/>
           <w:i w:val="0"/>
-          <w:color w:val="1F3B63"/>
-          <w:sz w:val="16"/>
-          <w:spacing w:val="12"/>
+          <w:sz w:val="19"/>
         </w:rPr>
-        <w:t>AI &amp; Data  ·  Machine Learning  ·  Computer Vision  ·  Responsible AI</w:t>
+        <w:t>AI &amp; DATA  |  MACHINE LEARNING  |  COMPUTER VISION  |  RESPONSIBLE AI</w:t>
       </w:r>
     </w:p>
     <w:p>
       <w:pPr>
-        <w:spacing w:after="74" w:before="0"/>
+        <w:spacing w:after="60" w:before="0"/>
         <w:jc w:val="center"/>
+      </w:pPr>
+      <w:r>
+        <w:rPr>
+          <w:b w:val="0"/>
+          <w:i w:val="0"/>
+          <w:color w:val="555555"/>
+          <w:sz w:val="18"/>
+        </w:rPr>
+        <w:t>justinfe@my.yorku.ca  |  (437) 556-5959  |  github.com/Justin-Fekri  |  Toronto, Canada</w:t>
+      </w:r>
+    </w:p>
+    <w:p>
+      <w:pPr>
+        <w:spacing w:after="40" w:before="100"/>
         <w:pBdr>
-          <w:bottom w:val="single" w:sz="12" w:space="2" w:color="1F3B63"/>
+          <w:bottom w:val="single" w:sz="8" w:space="1" w:color="1F3B63"/>
         </w:pBdr>
       </w:pPr>
       <w:r>
         <w:rPr>
-          <w:rFonts w:ascii="Georgia" w:hAnsi="Georgia"/>
-          <w:b w:val="0"/>
-          <w:i w:val="0"/>
-          <w:color w:val="5A5A5A"/>
-          <w:sz w:val="17"/>
-        </w:rPr>
-        <w:t>justinfe@my.yorku.ca   |   (437) 556-5959   |   github.com/Justin-Fekri   |   Toronto, Canada</w:t>
-      </w:r>
-    </w:p>
-    <w:p>
-      <w:pPr>
-        <w:spacing w:after="46" w:before="90"/>
-        <w:pBdr>
-          <w:bottom w:val="single" w:sz="6" w:space="2" w:color="B9C7DA"/>
-        </w:pBdr>
-      </w:pPr>
-      <w:r>
-        <w:rPr>
-          <w:rFonts w:ascii="Calibri" w:hAnsi="Calibri"/>
           <w:b/>
           <w:i w:val="0"/>
           <w:color w:val="1F3B63"/>
-          <w:sz w:val="16"/>
-          <w:spacing w:val="30"/>
+          <w:sz w:val="19"/>
         </w:rPr>
         <w:t>PROFESSIONAL SUMMARY</w:t>
       </w:r>
     </w:p>
     <w:p>
       <w:pPr>
-        <w:spacing w:after="0" w:before="0"/>
-        <w:jc w:val="both"/>
+        <w:spacing w:after="40" w:before="0"/>
       </w:pPr>
       <w:r>
         <w:rPr>
-          <w:rFonts w:ascii="Georgia" w:hAnsi="Georgia"/>
           <w:b w:val="0"/>
           <w:i w:val="0"/>
-          <w:sz w:val="17"/>
+          <w:sz w:val="18"/>
         </w:rPr>
-        <w:t>AI and machine learning practitioner who builds end-to-end and designs for review: faculty-led research in spatio-temporal medical-image segmentation, credit-risk scoring with explainable output and a human in the loop, and an enterprise RAG assistant over audit, risk, and cybersecurity documentation. Comfortable where models meet production and governance — imbalanced data, evaluation trade-offs, model drift, inference optimization, and role-based access.</w:t>
+        <w:t>AI and machine learning practitioner who builds end-to-end and designs for review: faculty-led research in spatio-temporal medical-image segmentation, credit-risk scoring with explainable output and a human in the loop, and an enterprise RAG assistant over audit, risk, and cybersecurity documentation. Comfortable where models meet production and governance — imbalanced data, evaluation trade-offs, model drift, inference optimization, and role-based access. Pursuing a BASc in Computer Science for Software Development (Co-op) at York University, Lassonde School of Engineering.</w:t>
       </w:r>
     </w:p>
     <w:p>
       <w:pPr>
-        <w:spacing w:after="46" w:before="90"/>
+        <w:spacing w:after="40" w:before="100"/>
         <w:pBdr>
-          <w:bottom w:val="single" w:sz="6" w:space="2" w:color="B9C7DA"/>
+          <w:bottom w:val="single" w:sz="8" w:space="1" w:color="1F3B63"/>
         </w:pBdr>
       </w:pPr>
       <w:r>
         <w:rPr>
-          <w:rFonts w:ascii="Calibri" w:hAnsi="Calibri"/>
           <w:b/>
           <w:i w:val="0"/>
           <w:color w:val="1F3B63"/>
-          <w:sz w:val="16"/>
-          <w:spacing w:val="30"/>
+          <w:sz w:val="19"/>
         </w:rPr>
         <w:t>TECHNICAL SKILLS</w:t>
       </w:r>
     </w:p>
     <w:p>
       <w:pPr>
-        <w:tabs>
-          <w:tab w:pos="2333" w:val="left"/>
-        </w:tabs>
-        <w:spacing w:after="24" w:before="0"/>
-        <w:ind w:left="2333" w:hanging="2333"/>
+        <w:spacing w:after="20" w:before="0"/>
       </w:pPr>
       <w:r>
         <w:rPr>
-          <w:rFonts w:ascii="Calibri" w:hAnsi="Calibri"/>
           <w:b/>
           <w:i w:val="0"/>
-          <w:color w:val="1F3B63"/>
-          <w:sz w:val="15"/>
+          <w:sz w:val="18"/>
         </w:rPr>
-        <w:t>EY Platforms &amp; Responsible AI</w:t>
+        <w:t xml:space="preserve">EY Platforms &amp; Responsible AI: </w:t>
       </w:r>
       <w:r>
         <w:rPr>
-          <w:rFonts w:ascii="Georgia" w:hAnsi="Georgia"/>
           <w:b w:val="0"/>
           <w:i w:val="0"/>
-          <w:sz w:val="17"/>
-        </w:rPr>
-        <w:tab/>
-      </w:r>
-      <w:r>
-        <w:rPr>
-          <w:rFonts w:ascii="Georgia" w:hAnsi="Georgia"/>
-          <w:b w:val="0"/>
-          <w:i w:val="0"/>
-          <w:sz w:val="17"/>
+          <w:sz w:val="18"/>
         </w:rPr>
         <w:t>EY.ai, EYQ, FlexiGenAI, Responsible AI framework; aligned to EY AI &amp; Data, Digital Engineering, and Technology Risk</w:t>
       </w:r>
     </w:p>
     <w:p>
       <w:pPr>
-        <w:tabs>
-          <w:tab w:pos="2333" w:val="left"/>
-        </w:tabs>
-        <w:spacing w:after="24" w:before="0"/>
-        <w:ind w:left="2333" w:hanging="2333"/>
+        <w:spacing w:after="20" w:before="0"/>
       </w:pPr>
       <w:r>
         <w:rPr>
-          <w:rFonts w:ascii="Calibri" w:hAnsi="Calibri"/>
           <w:b/>
           <w:i w:val="0"/>
-          <w:color w:val="1F3B63"/>
-          <w:sz w:val="15"/>
+          <w:sz w:val="18"/>
         </w:rPr>
-        <w:t>AI &amp; Machine Learning</w:t>
+        <w:t xml:space="preserve">AI &amp; Machine Learning: </w:t>
       </w:r>
       <w:r>
         <w:rPr>
-          <w:rFonts w:ascii="Georgia" w:hAnsi="Georgia"/>
           <w:b w:val="0"/>
           <w:i w:val="0"/>
-          <w:sz w:val="17"/>
-        </w:rPr>
-        <w:tab/>
-      </w:r>
-      <w:r>
-        <w:rPr>
-          <w:rFonts w:ascii="Georgia" w:hAnsi="Georgia"/>
-          <w:b w:val="0"/>
-          <w:i w:val="0"/>
-          <w:sz w:val="17"/>
+          <w:sz w:val="18"/>
         </w:rPr>
         <w:t>PyTorch, MONAI, computer vision, segmentation, classification, spatio-temporal modelling, model evaluation (precision, recall, F1, ROC-AUC), imbalanced data, model drift, explainable AI</w:t>
       </w:r>
     </w:p>
     <w:p>
       <w:pPr>
-        <w:tabs>
-          <w:tab w:pos="2333" w:val="left"/>
-        </w:tabs>
-        <w:spacing w:after="24" w:before="0"/>
-        <w:ind w:left="2333" w:hanging="2333"/>
+        <w:spacing w:after="20" w:before="0"/>
       </w:pPr>
       <w:r>
         <w:rPr>
-          <w:rFonts w:ascii="Calibri" w:hAnsi="Calibri"/>
           <w:b/>
           <w:i w:val="0"/>
-          <w:color w:val="1F3B63"/>
-          <w:sz w:val="15"/>
+          <w:sz w:val="18"/>
         </w:rPr>
-        <w:t>GenAI &amp; Agents</w:t>
+        <w:t xml:space="preserve">GenAI &amp; Agents: </w:t>
       </w:r>
       <w:r>
         <w:rPr>
-          <w:rFonts w:ascii="Georgia" w:hAnsi="Georgia"/>
           <w:b w:val="0"/>
           <w:i w:val="0"/>
-          <w:sz w:val="17"/>
+          <w:sz w:val="18"/>
         </w:rPr>
-        <w:tab/>
-      </w:r>
-      <w:r>
-        <w:rPr>
-          <w:rFonts w:ascii="Georgia" w:hAnsi="Georgia"/>
-          <w:b w:val="0"/>
-          <w:i w:val="0"/>
-          <w:sz w:val="17"/>
-        </w:rPr>
-        <w:t>RAG, MCP (Model Context Protocol), OpenAI-compatible API standard, vector databases, LangChain/LlamaIndex, RAGAS evaluation</w:t>
+        <w:t>RAG, MCP (Model Context Protocol), OpenAI-compatible API standard, vector databases, LangChain/LlamaIndex, RAGAS evaluation, prompt and retrieval evaluation</w:t>
       </w:r>
     </w:p>
     <w:p>
       <w:pPr>
-        <w:tabs>
-          <w:tab w:pos="2333" w:val="left"/>
-        </w:tabs>
-        <w:spacing w:after="24" w:before="0"/>
-        <w:ind w:left="2333" w:hanging="2333"/>
+        <w:spacing w:after="20" w:before="0"/>
       </w:pPr>
       <w:r>
         <w:rPr>
-          <w:rFonts w:ascii="Calibri" w:hAnsi="Calibri"/>
           <w:b/>
           <w:i w:val="0"/>
-          <w:color w:val="1F3B63"/>
-          <w:sz w:val="15"/>
+          <w:sz w:val="18"/>
         </w:rPr>
-        <w:t>Engineering &amp; Data</w:t>
+        <w:t xml:space="preserve">Engineering &amp; Data: </w:t>
       </w:r>
       <w:r>
         <w:rPr>
-          <w:rFonts w:ascii="Georgia" w:hAnsi="Georgia"/>
           <w:b w:val="0"/>
           <w:i w:val="0"/>
-          <w:sz w:val="17"/>
-        </w:rPr>
-        <w:tab/>
-      </w:r>
-      <w:r>
-        <w:rPr>
-          <w:rFonts w:ascii="Georgia" w:hAnsi="Georgia"/>
-          <w:b w:val="0"/>
-          <w:i w:val="0"/>
-          <w:sz w:val="17"/>
+          <w:sz w:val="18"/>
         </w:rPr>
         <w:t>Python, SQL, Java, JavaScript, Pandas (DataFrames), NumPy, Scikit-learn, XGBoost, FastAPI, Streamlit, Gradio, Docker, Kubernetes, TensorRT, Git</w:t>
       </w:r>
     </w:p>
     <w:p>
       <w:pPr>
-        <w:spacing w:after="46" w:before="90"/>
+        <w:spacing w:after="40" w:before="100"/>
         <w:pBdr>
-          <w:bottom w:val="single" w:sz="6" w:space="2" w:color="B9C7DA"/>
+          <w:bottom w:val="single" w:sz="8" w:space="1" w:color="1F3B63"/>
         </w:pBdr>
       </w:pPr>
       <w:r>
         <w:rPr>
-          <w:rFonts w:ascii="Calibri" w:hAnsi="Calibri"/>
           <w:b/>
           <w:i w:val="0"/>
           <w:color w:val="1F3B63"/>
-          <w:sz w:val="16"/>
-          <w:spacing w:val="30"/>
+          <w:sz w:val="19"/>
         </w:rPr>
         <w:t>AI RESEARCH EXPERIENCE</w:t>
       </w:r>
     </w:p>
     <w:p>
       <w:pPr>
-        <w:tabs>
-          <w:tab w:pos="10656" w:val="right"/>
-        </w:tabs>
-        <w:spacing w:after="0" w:before="54"/>
+        <w:spacing w:after="0" w:before="40"/>
       </w:pPr>
       <w:r>
         <w:rPr>
-          <w:rFonts w:ascii="Georgia" w:hAnsi="Georgia"/>
           <w:b/>
           <w:i w:val="0"/>
-          <w:sz w:val="18"/>
+          <w:sz w:val="19"/>
         </w:rPr>
         <w:t>Undergraduate Research Award (UGRA) &amp; Teaching Assistant</w:t>
       </w:r>
       <w:r>
         <w:rPr>
-          <w:rFonts w:ascii="Georgia" w:hAnsi="Georgia"/>
           <w:b w:val="0"/>
           <w:i w:val="0"/>
-          <w:color w:val="5A5A5A"/>
-          <w:sz w:val="17"/>
+          <w:color w:val="555555"/>
+          <w:sz w:val="18"/>
         </w:rPr>
-        <w:t xml:space="preserve">   |   York University</w:t>
+        <w:t xml:space="preserve">  |  York University  |  </w:t>
       </w:r>
       <w:r>
         <w:rPr>
-          <w:rFonts w:ascii="Georgia" w:hAnsi="Georgia"/>
-          <w:b w:val="0"/>
-          <w:i w:val="0"/>
-          <w:sz w:val="17"/>
-        </w:rPr>
-        <w:tab/>
-      </w:r>
-      <w:r>
-        <w:rPr>
-          <w:rFonts w:ascii="Calibri" w:hAnsi="Calibri"/>
           <w:b/>
           <w:i w:val="0"/>
-          <w:color w:val="1F3B63"/>
-          <w:sz w:val="15"/>
+          <w:sz w:val="18"/>
         </w:rPr>
         <w:t>2025</w:t>
       </w:r>
     </w:p>
     <w:p>
       <w:pPr>
-        <w:spacing w:after="0" w:before="0"/>
+        <w:spacing w:after="20" w:before="0"/>
       </w:pPr>
       <w:r>
         <w:rPr>
-          <w:rFonts w:ascii="Georgia" w:hAnsi="Georgia"/>
           <w:b w:val="0"/>
           <w:i/>
-          <w:color w:val="5A5A5A"/>
-          <w:sz w:val="17"/>
+          <w:color w:val="555555"/>
+          <w:sz w:val="18"/>
         </w:rPr>
-        <w:t>Supervisor: Prof. Navid Mohaghegh  ·  Spatio-Temporal Ultrasound Needle Segmentation</w:t>
+        <w:t>Supervisor: Prof. Navid Mohaghegh  —  Spatio-Temporal Ultrasound Needle Segmentation</w:t>
       </w:r>
     </w:p>
     <w:p>
       <w:pPr>
         <w:pStyle w:val="ListBullet"/>
-        <w:spacing w:after="16" w:line="254" w:lineRule="auto"/>
-        <w:ind w:left="274" w:hanging="166"/>
+        <w:spacing w:after="10"/>
+        <w:ind w:left="288" w:hanging="173"/>
       </w:pPr>
       <w:r>
         <w:rPr>
-          <w:rFonts w:ascii="Georgia" w:hAnsi="Georgia"/>
           <w:b w:val="0"/>
           <w:i w:val="0"/>
-          <w:sz w:val="17"/>
+          <w:sz w:val="18"/>
         </w:rPr>
         <w:t xml:space="preserve">Selected for a </w:t>
       </w:r>
       <w:r>
         <w:rPr>
-          <w:rFonts w:ascii="Georgia" w:hAnsi="Georgia"/>
           <w:b/>
           <w:i w:val="0"/>
-          <w:sz w:val="17"/>
+          <w:sz w:val="18"/>
         </w:rPr>
         <w:t>York Undergraduate Research Award</w:t>
       </w:r>
       <w:r>
         <w:rPr>
-          <w:rFonts w:ascii="Georgia" w:hAnsi="Georgia"/>
           <w:b w:val="0"/>
           <w:i w:val="0"/>
-          <w:sz w:val="17"/>
+          <w:sz w:val="18"/>
         </w:rPr>
         <w:t xml:space="preserve"> to work on AI-assisted needle localization in ultrasound, alongside teaching assistant duties for Prof. Mohaghegh.</w:t>
       </w:r>
@@ -373,51 +272,46 @@
     <w:p>
       <w:pPr>
         <w:pStyle w:val="ListBullet"/>
-        <w:spacing w:after="16" w:line="254" w:lineRule="auto"/>
-        <w:ind w:left="274" w:hanging="166"/>
+        <w:spacing w:after="10"/>
+        <w:ind w:left="288" w:hanging="173"/>
       </w:pPr>
       <w:r>
         <w:rPr>
-          <w:rFonts w:ascii="Georgia" w:hAnsi="Georgia"/>
           <w:b w:val="0"/>
           <w:i w:val="0"/>
-          <w:sz w:val="17"/>
+          <w:sz w:val="18"/>
         </w:rPr>
         <w:t xml:space="preserve">Built a PyTorch and MONAI segmentation pipeline pairing Swin Transformer </w:t>
       </w:r>
       <w:r>
         <w:rPr>
-          <w:rFonts w:ascii="Georgia" w:hAnsi="Georgia"/>
           <w:b/>
           <w:i w:val="0"/>
-          <w:sz w:val="17"/>
+          <w:sz w:val="18"/>
         </w:rPr>
         <w:t>spatial</w:t>
       </w:r>
       <w:r>
         <w:rPr>
-          <w:rFonts w:ascii="Georgia" w:hAnsi="Georgia"/>
           <w:b w:val="0"/>
           <w:i w:val="0"/>
-          <w:sz w:val="17"/>
+          <w:sz w:val="18"/>
         </w:rPr>
         <w:t xml:space="preserve"> feature extraction with ConvLSTM </w:t>
       </w:r>
       <w:r>
         <w:rPr>
-          <w:rFonts w:ascii="Georgia" w:hAnsi="Georgia"/>
           <w:b/>
           <w:i w:val="0"/>
-          <w:sz w:val="17"/>
+          <w:sz w:val="18"/>
         </w:rPr>
         <w:t>temporal</w:t>
       </w:r>
       <w:r>
         <w:rPr>
-          <w:rFonts w:ascii="Georgia" w:hAnsi="Georgia"/>
           <w:b w:val="0"/>
           <w:i w:val="0"/>
-          <w:sz w:val="17"/>
+          <w:sz w:val="18"/>
         </w:rPr>
         <w:t xml:space="preserve"> modelling across frames.</w:t>
       </w:r>
@@ -425,137 +319,108 @@
     <w:p>
       <w:pPr>
         <w:pStyle w:val="ListBullet"/>
-        <w:spacing w:after="16" w:line="254" w:lineRule="auto"/>
-        <w:ind w:left="274" w:hanging="166"/>
+        <w:spacing w:after="10"/>
+        <w:ind w:left="288" w:hanging="173"/>
       </w:pPr>
       <w:r>
         <w:rPr>
-          <w:rFonts w:ascii="Georgia" w:hAnsi="Georgia"/>
           <w:b w:val="0"/>
           <w:i w:val="0"/>
-          <w:sz w:val="17"/>
+          <w:sz w:val="18"/>
         </w:rPr>
         <w:t xml:space="preserve">Drove preprocessing, model development, and frame-level evaluation on sequential ultrasound, scoring segmentation quality with </w:t>
       </w:r>
       <w:r>
         <w:rPr>
-          <w:rFonts w:ascii="Georgia" w:hAnsi="Georgia"/>
           <w:b/>
           <w:i w:val="0"/>
-          <w:sz w:val="17"/>
+          <w:sz w:val="18"/>
         </w:rPr>
         <w:t>Dice and IoU</w:t>
       </w:r>
       <w:r>
         <w:rPr>
-          <w:rFonts w:ascii="Georgia" w:hAnsi="Georgia"/>
           <w:b w:val="0"/>
           <w:i w:val="0"/>
-          <w:sz w:val="17"/>
+          <w:sz w:val="18"/>
         </w:rPr>
         <w:t>.</w:t>
       </w:r>
     </w:p>
     <w:p>
       <w:pPr>
-        <w:spacing w:after="46" w:before="90"/>
+        <w:spacing w:after="40" w:before="100"/>
         <w:pBdr>
-          <w:bottom w:val="single" w:sz="6" w:space="2" w:color="B9C7DA"/>
+          <w:bottom w:val="single" w:sz="8" w:space="1" w:color="1F3B63"/>
         </w:pBdr>
       </w:pPr>
       <w:r>
         <w:rPr>
-          <w:rFonts w:ascii="Calibri" w:hAnsi="Calibri"/>
           <w:b/>
           <w:i w:val="0"/>
           <w:color w:val="1F3B63"/>
-          <w:sz w:val="16"/>
-          <w:spacing w:val="30"/>
+          <w:sz w:val="19"/>
         </w:rPr>
         <w:t>SELECTED AI PROJECTS</w:t>
       </w:r>
     </w:p>
     <w:p>
       <w:pPr>
-        <w:tabs>
-          <w:tab w:pos="10656" w:val="right"/>
-        </w:tabs>
-        <w:spacing w:after="0" w:before="54"/>
+        <w:spacing w:after="0" w:before="40"/>
       </w:pPr>
       <w:r>
         <w:rPr>
-          <w:rFonts w:ascii="Georgia" w:hAnsi="Georgia"/>
           <w:b/>
           <w:i w:val="0"/>
-          <w:sz w:val="18"/>
+          <w:sz w:val="19"/>
         </w:rPr>
         <w:t>Enterprise Document Question-Answering Assistant</w:t>
       </w:r>
       <w:r>
         <w:rPr>
-          <w:rFonts w:ascii="Georgia" w:hAnsi="Georgia"/>
           <w:b w:val="0"/>
           <w:i w:val="0"/>
-          <w:sz w:val="17"/>
+          <w:color w:val="555555"/>
+          <w:sz w:val="18"/>
         </w:rPr>
-        <w:tab/>
+        <w:t xml:space="preserve">  |  Python  |  RAG  |  MCP  |  FastAPI  |  Gradio  |  RAGAS  |  </w:t>
       </w:r>
       <w:r>
         <w:rPr>
-          <w:rFonts w:ascii="Calibri" w:hAnsi="Calibri"/>
           <w:b/>
           <w:i w:val="0"/>
-          <w:color w:val="1F3B63"/>
-          <w:sz w:val="15"/>
+          <w:sz w:val="18"/>
         </w:rPr>
         <w:t>2026</w:t>
       </w:r>
     </w:p>
     <w:p>
       <w:pPr>
-        <w:spacing w:after="0" w:before="0"/>
+        <w:pStyle w:val="ListBullet"/>
+        <w:spacing w:after="10"/>
+        <w:ind w:left="288" w:hanging="173"/>
       </w:pPr>
       <w:r>
         <w:rPr>
-          <w:rFonts w:ascii="Calibri" w:hAnsi="Calibri"/>
           <w:b w:val="0"/>
           <w:i w:val="0"/>
-          <w:color w:val="46617F"/>
-          <w:sz w:val="15"/>
-        </w:rPr>
-        <w:t>Python · RAG · MCP · FastAPI · Gradio · RAGAS</w:t>
-      </w:r>
-    </w:p>
-    <w:p>
-      <w:pPr>
-        <w:pStyle w:val="ListBullet"/>
-        <w:spacing w:after="16" w:line="254" w:lineRule="auto"/>
-        <w:ind w:left="274" w:hanging="166"/>
-      </w:pPr>
-      <w:r>
-        <w:rPr>
-          <w:rFonts w:ascii="Georgia" w:hAnsi="Georgia"/>
-          <w:b w:val="0"/>
-          <w:i w:val="0"/>
-          <w:sz w:val="17"/>
+          <w:sz w:val="18"/>
         </w:rPr>
         <w:t xml:space="preserve">Shipped a RAG assistant over company policies, </w:t>
       </w:r>
       <w:r>
         <w:rPr>
-          <w:rFonts w:ascii="Georgia" w:hAnsi="Georgia"/>
           <w:b/>
           <w:i w:val="0"/>
-          <w:sz w:val="17"/>
+          <w:sz w:val="18"/>
         </w:rPr>
         <w:t>audit procedures, risk reports, and cybersecurity documentation</w:t>
       </w:r>
       <w:r>
         <w:rPr>
-          <w:rFonts w:ascii="Georgia" w:hAnsi="Georgia"/>
           <w:b w:val="0"/>
           <w:i w:val="0"/>
-          <w:sz w:val="17"/>
+          <w:sz w:val="18"/>
         </w:rPr>
         <w:t xml:space="preserve"> in PDF and Word — the document classes an assurance team works in.</w:t>
       </w:r>
@@ -563,33 +428,30 @@
     <w:p>
       <w:pPr>
         <w:pStyle w:val="ListBullet"/>
-        <w:spacing w:after="16" w:line="254" w:lineRule="auto"/>
-        <w:ind w:left="274" w:hanging="166"/>
+        <w:spacing w:after="10"/>
+        <w:ind w:left="288" w:hanging="173"/>
       </w:pPr>
       <w:r>
         <w:rPr>
-          <w:rFonts w:ascii="Georgia" w:hAnsi="Georgia"/>
           <w:b w:val="0"/>
           <w:i w:val="0"/>
-          <w:sz w:val="17"/>
+          <w:sz w:val="18"/>
         </w:rPr>
         <w:t xml:space="preserve">Exposed retrieval as </w:t>
       </w:r>
       <w:r>
         <w:rPr>
-          <w:rFonts w:ascii="Georgia" w:hAnsi="Georgia"/>
           <w:b/>
           <w:i w:val="0"/>
-          <w:sz w:val="17"/>
+          <w:sz w:val="18"/>
         </w:rPr>
         <w:t>MCP</w:t>
       </w:r>
       <w:r>
         <w:rPr>
-          <w:rFonts w:ascii="Georgia" w:hAnsi="Georgia"/>
           <w:b w:val="0"/>
           <w:i w:val="0"/>
-          <w:sz w:val="17"/>
+          <w:sz w:val="18"/>
         </w:rPr>
         <w:t xml:space="preserve"> tools behind an OpenAI-compatible API so agentic clients can drive the assistant directly.</w:t>
       </w:r>
@@ -597,33 +459,30 @@
     <w:p>
       <w:pPr>
         <w:pStyle w:val="ListBullet"/>
-        <w:spacing w:after="16" w:line="254" w:lineRule="auto"/>
-        <w:ind w:left="274" w:hanging="166"/>
+        <w:spacing w:after="10"/>
+        <w:ind w:left="288" w:hanging="173"/>
       </w:pPr>
       <w:r>
         <w:rPr>
-          <w:rFonts w:ascii="Georgia" w:hAnsi="Georgia"/>
           <w:b w:val="0"/>
           <w:i w:val="0"/>
-          <w:sz w:val="17"/>
+          <w:sz w:val="18"/>
         </w:rPr>
         <w:t xml:space="preserve">Returned </w:t>
       </w:r>
       <w:r>
         <w:rPr>
-          <w:rFonts w:ascii="Georgia" w:hAnsi="Georgia"/>
           <w:b/>
           <w:i w:val="0"/>
-          <w:sz w:val="17"/>
+          <w:sz w:val="18"/>
         </w:rPr>
         <w:t>page-level citations</w:t>
       </w:r>
       <w:r>
         <w:rPr>
-          <w:rFonts w:ascii="Georgia" w:hAnsi="Georgia"/>
           <w:b w:val="0"/>
           <w:i w:val="0"/>
-          <w:sz w:val="17"/>
+          <w:sz w:val="18"/>
         </w:rPr>
         <w:t xml:space="preserve"> and abstained when the corpus lacked evidence, rather than answering from thin retrieval.</w:t>
       </w:r>
@@ -631,118 +490,91 @@
     <w:p>
       <w:pPr>
         <w:pStyle w:val="ListBullet"/>
-        <w:spacing w:after="16" w:line="254" w:lineRule="auto"/>
-        <w:ind w:left="274" w:hanging="166"/>
+        <w:spacing w:after="10"/>
+        <w:ind w:left="288" w:hanging="173"/>
       </w:pPr>
       <w:r>
         <w:rPr>
-          <w:rFonts w:ascii="Georgia" w:hAnsi="Georgia"/>
           <w:b w:val="0"/>
           <w:i w:val="0"/>
-          <w:sz w:val="17"/>
+          <w:sz w:val="18"/>
         </w:rPr>
         <w:t xml:space="preserve">Tuned chunking and retrieval against </w:t>
       </w:r>
       <w:r>
         <w:rPr>
-          <w:rFonts w:ascii="Georgia" w:hAnsi="Georgia"/>
           <w:b/>
           <w:i w:val="0"/>
-          <w:sz w:val="17"/>
+          <w:sz w:val="18"/>
         </w:rPr>
         <w:t>RAGAS</w:t>
       </w:r>
       <w:r>
         <w:rPr>
-          <w:rFonts w:ascii="Georgia" w:hAnsi="Georgia"/>
           <w:b w:val="0"/>
           <w:i w:val="0"/>
-          <w:sz w:val="17"/>
+          <w:sz w:val="18"/>
         </w:rPr>
         <w:t xml:space="preserve"> faithfulness scores, behind </w:t>
       </w:r>
       <w:r>
         <w:rPr>
-          <w:rFonts w:ascii="Georgia" w:hAnsi="Georgia"/>
           <w:b/>
           <w:i w:val="0"/>
-          <w:sz w:val="17"/>
+          <w:sz w:val="18"/>
         </w:rPr>
         <w:t>role-based permissions</w:t>
       </w:r>
       <w:r>
         <w:rPr>
-          <w:rFonts w:ascii="Georgia" w:hAnsi="Georgia"/>
           <w:b w:val="0"/>
           <w:i w:val="0"/>
-          <w:sz w:val="17"/>
+          <w:sz w:val="18"/>
         </w:rPr>
         <w:t xml:space="preserve"> so each user retrieves only what their role allows.</w:t>
       </w:r>
     </w:p>
     <w:p>
       <w:pPr>
-        <w:tabs>
-          <w:tab w:pos="10656" w:val="right"/>
-        </w:tabs>
-        <w:spacing w:after="0" w:before="54"/>
+        <w:spacing w:after="0" w:before="40"/>
       </w:pPr>
       <w:r>
         <w:rPr>
-          <w:rFonts w:ascii="Georgia" w:hAnsi="Georgia"/>
           <w:b/>
           <w:i w:val="0"/>
-          <w:sz w:val="18"/>
+          <w:sz w:val="19"/>
         </w:rPr>
         <w:t>AI Credit Risk &amp; Loan Decision Support System</w:t>
       </w:r>
       <w:r>
         <w:rPr>
-          <w:rFonts w:ascii="Georgia" w:hAnsi="Georgia"/>
           <w:b w:val="0"/>
           <w:i w:val="0"/>
-          <w:sz w:val="17"/>
+          <w:color w:val="555555"/>
+          <w:sz w:val="18"/>
         </w:rPr>
-        <w:tab/>
+        <w:t xml:space="preserve">  |  Python  |  Scikit-learn  |  XGBoost  |  Explainable AI  |  </w:t>
       </w:r>
       <w:r>
         <w:rPr>
-          <w:rFonts w:ascii="Calibri" w:hAnsi="Calibri"/>
           <w:b/>
           <w:i w:val="0"/>
-          <w:color w:val="1F3B63"/>
-          <w:sz w:val="15"/>
+          <w:sz w:val="18"/>
         </w:rPr>
         <w:t>2026</w:t>
       </w:r>
     </w:p>
     <w:p>
       <w:pPr>
-        <w:spacing w:after="0" w:before="0"/>
+        <w:pStyle w:val="ListBullet"/>
+        <w:spacing w:after="10"/>
+        <w:ind w:left="288" w:hanging="173"/>
       </w:pPr>
       <w:r>
         <w:rPr>
-          <w:rFonts w:ascii="Calibri" w:hAnsi="Calibri"/>
           <w:b w:val="0"/>
           <w:i w:val="0"/>
-          <w:color w:val="46617F"/>
-          <w:sz w:val="15"/>
-        </w:rPr>
-        <w:t>Python · Scikit-learn · XGBoost · Explainable AI</w:t>
-      </w:r>
-    </w:p>
-    <w:p>
-      <w:pPr>
-        <w:pStyle w:val="ListBullet"/>
-        <w:spacing w:after="16" w:line="254" w:lineRule="auto"/>
-        <w:ind w:left="274" w:hanging="166"/>
-      </w:pPr>
-      <w:r>
-        <w:rPr>
-          <w:rFonts w:ascii="Georgia" w:hAnsi="Georgia"/>
-          <w:b w:val="0"/>
-          <w:i w:val="0"/>
-          <w:sz w:val="17"/>
+          <w:sz w:val="18"/>
         </w:rPr>
         <w:t>Modelled borrower credit history and financial attributes to estimate loan eligibility and default risk.</w:t>
       </w:r>
@@ -750,33 +582,30 @@
     <w:p>
       <w:pPr>
         <w:pStyle w:val="ListBullet"/>
-        <w:spacing w:after="16" w:line="254" w:lineRule="auto"/>
-        <w:ind w:left="274" w:hanging="166"/>
+        <w:spacing w:after="10"/>
+        <w:ind w:left="288" w:hanging="173"/>
       </w:pPr>
       <w:r>
         <w:rPr>
-          <w:rFonts w:ascii="Georgia" w:hAnsi="Georgia"/>
           <w:b w:val="0"/>
           <w:i w:val="0"/>
-          <w:sz w:val="17"/>
+          <w:sz w:val="18"/>
         </w:rPr>
         <w:t xml:space="preserve">Tuned against a heavily </w:t>
       </w:r>
       <w:r>
         <w:rPr>
-          <w:rFonts w:ascii="Georgia" w:hAnsi="Georgia"/>
           <w:b/>
           <w:i w:val="0"/>
-          <w:sz w:val="17"/>
+          <w:sz w:val="18"/>
         </w:rPr>
         <w:t>imbalanced</w:t>
       </w:r>
       <w:r>
         <w:rPr>
-          <w:rFonts w:ascii="Georgia" w:hAnsi="Georgia"/>
           <w:b w:val="0"/>
           <w:i w:val="0"/>
-          <w:sz w:val="17"/>
+          <w:sz w:val="18"/>
         </w:rPr>
         <w:t xml:space="preserve"> default population, weighing false positives against false negatives across precision, recall, F1, ROC-AUC, and confusion-matrix analysis.</w:t>
       </w:r>
@@ -784,33 +613,30 @@
     <w:p>
       <w:pPr>
         <w:pStyle w:val="ListBullet"/>
-        <w:spacing w:after="16" w:line="254" w:lineRule="auto"/>
-        <w:ind w:left="274" w:hanging="166"/>
+        <w:spacing w:after="10"/>
+        <w:ind w:left="288" w:hanging="173"/>
       </w:pPr>
       <w:r>
         <w:rPr>
-          <w:rFonts w:ascii="Georgia" w:hAnsi="Georgia"/>
           <w:b w:val="0"/>
           <w:i w:val="0"/>
-          <w:sz w:val="17"/>
+          <w:sz w:val="18"/>
         </w:rPr>
         <w:t xml:space="preserve">Surfaced the features driving each decision through </w:t>
       </w:r>
       <w:r>
         <w:rPr>
-          <w:rFonts w:ascii="Georgia" w:hAnsi="Georgia"/>
           <w:b/>
           <w:i w:val="0"/>
-          <w:sz w:val="17"/>
+          <w:sz w:val="18"/>
         </w:rPr>
         <w:t>explainable-AI</w:t>
       </w:r>
       <w:r>
         <w:rPr>
-          <w:rFonts w:ascii="Georgia" w:hAnsi="Georgia"/>
           <w:b w:val="0"/>
           <w:i w:val="0"/>
-          <w:sz w:val="17"/>
+          <w:sz w:val="18"/>
         </w:rPr>
         <w:t xml:space="preserve"> output, so a reviewer can see why an applicant scored the way they did.</w:t>
       </w:r>
@@ -818,100 +644,75 @@
     <w:p>
       <w:pPr>
         <w:pStyle w:val="ListBullet"/>
-        <w:spacing w:after="16" w:line="254" w:lineRule="auto"/>
-        <w:ind w:left="274" w:hanging="166"/>
+        <w:spacing w:after="10"/>
+        <w:ind w:left="288" w:hanging="173"/>
       </w:pPr>
       <w:r>
         <w:rPr>
-          <w:rFonts w:ascii="Georgia" w:hAnsi="Georgia"/>
           <w:b w:val="0"/>
           <w:i w:val="0"/>
-          <w:sz w:val="17"/>
+          <w:sz w:val="18"/>
         </w:rPr>
         <w:t xml:space="preserve">Framed the system as </w:t>
       </w:r>
       <w:r>
         <w:rPr>
-          <w:rFonts w:ascii="Georgia" w:hAnsi="Georgia"/>
           <w:b/>
           <w:i w:val="0"/>
-          <w:sz w:val="17"/>
+          <w:sz w:val="18"/>
         </w:rPr>
         <w:t>decision support, not automatic approval</w:t>
       </w:r>
       <w:r>
         <w:rPr>
-          <w:rFonts w:ascii="Georgia" w:hAnsi="Georgia"/>
           <w:b w:val="0"/>
           <w:i w:val="0"/>
-          <w:sz w:val="17"/>
+          <w:sz w:val="18"/>
         </w:rPr>
         <w:t>, keeping the final lending call with a human — the control a regulated lender is required to evidence.</w:t>
       </w:r>
     </w:p>
     <w:p>
       <w:pPr>
-        <w:tabs>
-          <w:tab w:pos="10656" w:val="right"/>
-        </w:tabs>
-        <w:spacing w:after="0" w:before="54"/>
+        <w:spacing w:after="0" w:before="40"/>
       </w:pPr>
       <w:r>
         <w:rPr>
-          <w:rFonts w:ascii="Georgia" w:hAnsi="Georgia"/>
           <w:b/>
           <w:i w:val="0"/>
-          <w:sz w:val="18"/>
+          <w:sz w:val="19"/>
         </w:rPr>
         <w:t>Medical Image Cancer Detection Prototype</w:t>
       </w:r>
       <w:r>
         <w:rPr>
-          <w:rFonts w:ascii="Georgia" w:hAnsi="Georgia"/>
           <w:b w:val="0"/>
           <w:i w:val="0"/>
-          <w:sz w:val="17"/>
+          <w:color w:val="555555"/>
+          <w:sz w:val="18"/>
         </w:rPr>
-        <w:tab/>
+        <w:t xml:space="preserve">  |  Python  |  PyTorch  |  EfficientNet-B0  |  TensorRT  |  Streamlit  |  </w:t>
       </w:r>
       <w:r>
         <w:rPr>
-          <w:rFonts w:ascii="Calibri" w:hAnsi="Calibri"/>
           <w:b/>
           <w:i w:val="0"/>
-          <w:color w:val="1F3B63"/>
-          <w:sz w:val="15"/>
+          <w:sz w:val="18"/>
         </w:rPr>
         <w:t>2025</w:t>
       </w:r>
     </w:p>
     <w:p>
       <w:pPr>
-        <w:spacing w:after="0" w:before="0"/>
+        <w:pStyle w:val="ListBullet"/>
+        <w:spacing w:after="10"/>
+        <w:ind w:left="288" w:hanging="173"/>
       </w:pPr>
       <w:r>
         <w:rPr>
-          <w:rFonts w:ascii="Calibri" w:hAnsi="Calibri"/>
           <w:b w:val="0"/>
           <w:i w:val="0"/>
-          <w:color w:val="46617F"/>
-          <w:sz w:val="15"/>
-        </w:rPr>
-        <w:t>Python · PyTorch · EfficientNet-B0 · TensorRT · Streamlit</w:t>
-      </w:r>
-    </w:p>
-    <w:p>
-      <w:pPr>
-        <w:pStyle w:val="ListBullet"/>
-        <w:spacing w:after="16" w:line="254" w:lineRule="auto"/>
-        <w:ind w:left="274" w:hanging="166"/>
-      </w:pPr>
-      <w:r>
-        <w:rPr>
-          <w:rFonts w:ascii="Georgia" w:hAnsi="Georgia"/>
-          <w:b w:val="0"/>
-          <w:i w:val="0"/>
-          <w:sz w:val="17"/>
+          <w:sz w:val="18"/>
         </w:rPr>
         <w:t>Trained a CNN classifier that standardizes images to 224 x 224 RGB, with a sigmoid probability and an adjustable decision threshold.</w:t>
       </w:r>
@@ -919,33 +720,30 @@
     <w:p>
       <w:pPr>
         <w:pStyle w:val="ListBullet"/>
-        <w:spacing w:after="16" w:line="254" w:lineRule="auto"/>
-        <w:ind w:left="274" w:hanging="166"/>
+        <w:spacing w:after="10"/>
+        <w:ind w:left="288" w:hanging="173"/>
       </w:pPr>
       <w:r>
         <w:rPr>
-          <w:rFonts w:ascii="Georgia" w:hAnsi="Georgia"/>
           <w:b w:val="0"/>
           <w:i w:val="0"/>
-          <w:sz w:val="17"/>
+          <w:sz w:val="18"/>
         </w:rPr>
         <w:t xml:space="preserve">Cut model size and inference latency with </w:t>
       </w:r>
       <w:r>
         <w:rPr>
-          <w:rFonts w:ascii="Georgia" w:hAnsi="Georgia"/>
           <w:b/>
           <w:i w:val="0"/>
-          <w:sz w:val="17"/>
+          <w:sz w:val="18"/>
         </w:rPr>
         <w:t>TensorRT</w:t>
       </w:r>
       <w:r>
         <w:rPr>
-          <w:rFonts w:ascii="Georgia" w:hAnsi="Georgia"/>
           <w:b w:val="0"/>
           <w:i w:val="0"/>
-          <w:sz w:val="17"/>
+          <w:sz w:val="18"/>
         </w:rPr>
         <w:t xml:space="preserve"> quantization and pruning, tracking the accuracy trade-off at each step.</w:t>
       </w:r>
@@ -953,127 +751,225 @@
     <w:p>
       <w:pPr>
         <w:pStyle w:val="ListBullet"/>
-        <w:spacing w:after="16" w:line="254" w:lineRule="auto"/>
-        <w:ind w:left="274" w:hanging="166"/>
+        <w:spacing w:after="10"/>
+        <w:ind w:left="288" w:hanging="173"/>
       </w:pPr>
       <w:r>
         <w:rPr>
-          <w:rFonts w:ascii="Georgia" w:hAnsi="Georgia"/>
           <w:b w:val="0"/>
           <w:i w:val="0"/>
-          <w:sz w:val="17"/>
+          <w:sz w:val="18"/>
         </w:rPr>
         <w:t xml:space="preserve">Added visual interpretability for reviewer oversight, with output labelled explicitly as </w:t>
       </w:r>
       <w:r>
         <w:rPr>
-          <w:rFonts w:ascii="Georgia" w:hAnsi="Georgia"/>
           <w:b/>
           <w:i w:val="0"/>
-          <w:sz w:val="17"/>
+          <w:sz w:val="18"/>
         </w:rPr>
         <w:t>educational and research-only, not diagnostic</w:t>
       </w:r>
       <w:r>
         <w:rPr>
-          <w:rFonts w:ascii="Georgia" w:hAnsi="Georgia"/>
           <w:b w:val="0"/>
           <w:i w:val="0"/>
-          <w:sz w:val="17"/>
+          <w:sz w:val="18"/>
         </w:rPr>
         <w:t>.</w:t>
       </w:r>
     </w:p>
     <w:p>
       <w:pPr>
-        <w:spacing w:after="46" w:before="90"/>
+        <w:spacing w:after="40" w:before="100"/>
         <w:pBdr>
-          <w:bottom w:val="single" w:sz="6" w:space="2" w:color="B9C7DA"/>
+          <w:bottom w:val="single" w:sz="8" w:space="1" w:color="1F3B63"/>
         </w:pBdr>
       </w:pPr>
       <w:r>
         <w:rPr>
-          <w:rFonts w:ascii="Calibri" w:hAnsi="Calibri"/>
           <w:b/>
           <w:i w:val="0"/>
           <w:color w:val="1F3B63"/>
-          <w:sz w:val="16"/>
-          <w:spacing w:val="30"/>
+          <w:sz w:val="19"/>
         </w:rPr>
-        <w:t>EDUCATION &amp; CERTIFICATION</w:t>
+        <w:t>EDUCATION</w:t>
       </w:r>
     </w:p>
     <w:p>
       <w:pPr>
-        <w:tabs>
-          <w:tab w:pos="10656" w:val="right"/>
-        </w:tabs>
-        <w:spacing w:after="0" w:before="54"/>
+        <w:spacing w:after="0" w:before="40"/>
       </w:pPr>
       <w:r>
         <w:rPr>
-          <w:rFonts w:ascii="Georgia" w:hAnsi="Georgia"/>
           <w:b/>
           <w:i w:val="0"/>
-          <w:sz w:val="18"/>
+          <w:sz w:val="19"/>
         </w:rPr>
         <w:t>York University, Lassonde School of Engineering</w:t>
       </w:r>
       <w:r>
         <w:rPr>
-          <w:rFonts w:ascii="Georgia" w:hAnsi="Georgia"/>
           <w:b w:val="0"/>
           <w:i w:val="0"/>
-          <w:color w:val="5A5A5A"/>
-          <w:sz w:val="17"/>
+          <w:color w:val="555555"/>
+          <w:sz w:val="18"/>
         </w:rPr>
-        <w:t xml:space="preserve">   |   Toronto (Markham Campus)</w:t>
+        <w:t xml:space="preserve">  |  Toronto (Markham Campus)  |  </w:t>
       </w:r>
       <w:r>
         <w:rPr>
-          <w:rFonts w:ascii="Georgia" w:hAnsi="Georgia"/>
-          <w:b w:val="0"/>
-          <w:i w:val="0"/>
-          <w:sz w:val="17"/>
-        </w:rPr>
-        <w:tab/>
-      </w:r>
-      <w:r>
-        <w:rPr>
-          <w:rFonts w:ascii="Calibri" w:hAnsi="Calibri"/>
           <w:b/>
           <w:i w:val="0"/>
-          <w:color w:val="1F3B63"/>
-          <w:sz w:val="15"/>
+          <w:sz w:val="18"/>
         </w:rPr>
         <w:t>Expected 2029</w:t>
       </w:r>
     </w:p>
     <w:p>
       <w:pPr>
-        <w:spacing w:after="0" w:before="0"/>
+        <w:spacing w:after="20" w:before="0"/>
       </w:pPr>
       <w:r>
         <w:rPr>
-          <w:rFonts w:ascii="Georgia" w:hAnsi="Georgia"/>
           <w:b w:val="0"/>
-          <w:i/>
-          <w:color w:val="5A5A5A"/>
-          <w:sz w:val="17"/>
+          <w:i w:val="0"/>
+          <w:color w:val="555555"/>
+          <w:sz w:val="18"/>
         </w:rPr>
-        <w:t>Bachelor of Applied Science (BASc), Computer Science for Software Development, Co-op  ·  GPA: 6.7/9.0</w:t>
+        <w:t>Bachelor of Applied Science (BASc), Computer Science for Software Development, Co-op  |  GPA: 6.7/9.0</w:t>
       </w:r>
     </w:p>
     <w:p>
       <w:pPr>
-        <w:tabs>
-          <w:tab w:pos="10656" w:val="right"/>
-        </w:tabs>
-        <w:spacing w:after="0" w:before="54"/>
+        <w:spacing w:after="40" w:before="100"/>
+        <w:pBdr>
+          <w:bottom w:val="single" w:sz="8" w:space="1" w:color="1F3B63"/>
+        </w:pBdr>
       </w:pPr>
       <w:r>
         <w:rPr>
-          <w:rFonts w:ascii="Georgia" w:hAnsi="Georgia"/>
+          <w:b/>
+          <w:i w:val="0"/>
+          <w:color w:val="1F3B63"/>
+          <w:sz w:val="19"/>
+        </w:rPr>
+        <w:t>ADDITIONAL EXPERIENCE</w:t>
+      </w:r>
+    </w:p>
+    <w:p>
+      <w:pPr>
+        <w:spacing w:after="20" w:before="0"/>
+      </w:pPr>
+      <w:r>
+        <w:rPr>
+          <w:b/>
+          <w:i w:val="0"/>
+          <w:sz w:val="18"/>
+        </w:rPr>
+        <w:t>Operations Assistant</w:t>
+      </w:r>
+      <w:r>
+        <w:rPr>
+          <w:b w:val="0"/>
+          <w:i w:val="0"/>
+          <w:color w:val="555555"/>
+          <w:sz w:val="18"/>
+        </w:rPr>
+        <w:t xml:space="preserve">  |  York University  |  </w:t>
+      </w:r>
+      <w:r>
+        <w:rPr>
+          <w:b/>
+          <w:i w:val="0"/>
+          <w:sz w:val="18"/>
+        </w:rPr>
+        <w:t>May 2026 - Sep 2026</w:t>
+      </w:r>
+    </w:p>
+    <w:p>
+      <w:pPr>
+        <w:spacing w:after="20" w:before="0"/>
+      </w:pPr>
+      <w:r>
+        <w:rPr>
+          <w:b/>
+          <w:i w:val="0"/>
+          <w:sz w:val="18"/>
+        </w:rPr>
+        <w:t>Program &amp; Administrative Assistant</w:t>
+      </w:r>
+      <w:r>
+        <w:rPr>
+          <w:b w:val="0"/>
+          <w:i w:val="0"/>
+          <w:color w:val="555555"/>
+          <w:sz w:val="18"/>
+        </w:rPr>
+        <w:t xml:space="preserve">  |  YMCA of Greater Toronto  |  </w:t>
+      </w:r>
+      <w:r>
+        <w:rPr>
+          <w:b/>
+          <w:i w:val="0"/>
+          <w:sz w:val="18"/>
+        </w:rPr>
+        <w:t>Dec 2024 - Jan 2026</w:t>
+      </w:r>
+    </w:p>
+    <w:p>
+      <w:pPr>
+        <w:spacing w:after="20" w:before="0"/>
+      </w:pPr>
+      <w:r>
+        <w:rPr>
+          <w:b/>
+          <w:i w:val="0"/>
+          <w:sz w:val="18"/>
+        </w:rPr>
+        <w:t>IT Support &amp; Lab Assistant, Volunteer</w:t>
+      </w:r>
+      <w:r>
+        <w:rPr>
+          <w:b w:val="0"/>
+          <w:i w:val="0"/>
+          <w:color w:val="555555"/>
+          <w:sz w:val="18"/>
+        </w:rPr>
+        <w:t xml:space="preserve">  |  Toronto Public Library  |  </w:t>
+      </w:r>
+      <w:r>
+        <w:rPr>
+          <w:b/>
+          <w:i w:val="0"/>
+          <w:sz w:val="18"/>
+        </w:rPr>
+        <w:t>Mar 2023 - Sep 2023</w:t>
+      </w:r>
+    </w:p>
+    <w:p>
+      <w:pPr>
+        <w:spacing w:after="40" w:before="100"/>
+        <w:pBdr>
+          <w:bottom w:val="single" w:sz="8" w:space="1" w:color="1F3B63"/>
+        </w:pBdr>
+      </w:pPr>
+      <w:r>
+        <w:rPr>
+          <w:b/>
+          <w:i w:val="0"/>
+          <w:color w:val="1F3B63"/>
+          <w:sz w:val="19"/>
+        </w:rPr>
+        <w:t>CERTIFICATION IN PROGRESS</w:t>
+      </w:r>
+    </w:p>
+    <w:p>
+      <w:pPr>
+        <w:spacing w:after="20" w:before="0"/>
+      </w:pPr>
+      <w:r>
+        <w:rPr>
           <w:b/>
           <w:i w:val="0"/>
           <w:sz w:val="18"/>
@@ -1082,194 +978,25 @@
       </w:r>
       <w:r>
         <w:rPr>
-          <w:rFonts w:ascii="Georgia" w:hAnsi="Georgia"/>
           <w:b w:val="0"/>
           <w:i w:val="0"/>
-          <w:color w:val="5A5A5A"/>
-          <w:sz w:val="17"/>
+          <w:color w:val="555555"/>
+          <w:sz w:val="18"/>
         </w:rPr>
-        <w:t xml:space="preserve">   |   Microsoft</w:t>
+        <w:t xml:space="preserve">  |  Microsoft  |  </w:t>
       </w:r>
       <w:r>
         <w:rPr>
-          <w:rFonts w:ascii="Georgia" w:hAnsi="Georgia"/>
-          <w:b w:val="0"/>
-          <w:i w:val="0"/>
-          <w:sz w:val="17"/>
-        </w:rPr>
-        <w:tab/>
-      </w:r>
-      <w:r>
-        <w:rPr>
-          <w:rFonts w:ascii="Calibri" w:hAnsi="Calibri"/>
           <w:b/>
           <w:i w:val="0"/>
-          <w:color w:val="1F3B63"/>
-          <w:sz w:val="15"/>
+          <w:sz w:val="18"/>
         </w:rPr>
         <w:t>In Progress</w:t>
       </w:r>
     </w:p>
-    <w:p>
-      <w:pPr>
-        <w:spacing w:after="46" w:before="90"/>
-        <w:pBdr>
-          <w:bottom w:val="single" w:sz="6" w:space="2" w:color="B9C7DA"/>
-        </w:pBdr>
-      </w:pPr>
-      <w:r>
-        <w:rPr>
-          <w:rFonts w:ascii="Calibri" w:hAnsi="Calibri"/>
-          <w:b/>
-          <w:i w:val="0"/>
-          <w:color w:val="1F3B63"/>
-          <w:sz w:val="16"/>
-          <w:spacing w:val="30"/>
-        </w:rPr>
-        <w:t>ADDITIONAL EXPERIENCE</w:t>
-      </w:r>
-    </w:p>
-    <w:p>
-      <w:pPr>
-        <w:tabs>
-          <w:tab w:pos="10656" w:val="right"/>
-        </w:tabs>
-        <w:spacing w:after="24" w:before="0"/>
-      </w:pPr>
-      <w:r>
-        <w:rPr>
-          <w:rFonts w:ascii="Georgia" w:hAnsi="Georgia"/>
-          <w:b/>
-          <w:i w:val="0"/>
-          <w:sz w:val="17"/>
-        </w:rPr>
-        <w:t>Operations Assistant</w:t>
-      </w:r>
-      <w:r>
-        <w:rPr>
-          <w:rFonts w:ascii="Georgia" w:hAnsi="Georgia"/>
-          <w:b w:val="0"/>
-          <w:i w:val="0"/>
-          <w:color w:val="5A5A5A"/>
-          <w:sz w:val="17"/>
-        </w:rPr>
-        <w:t xml:space="preserve">   |   York University</w:t>
-      </w:r>
-      <w:r>
-        <w:rPr>
-          <w:rFonts w:ascii="Georgia" w:hAnsi="Georgia"/>
-          <w:b w:val="0"/>
-          <w:i w:val="0"/>
-          <w:sz w:val="17"/>
-        </w:rPr>
-        <w:tab/>
-      </w:r>
-      <w:r>
-        <w:rPr>
-          <w:rFonts w:ascii="Calibri" w:hAnsi="Calibri"/>
-          <w:b/>
-          <w:i w:val="0"/>
-          <w:color w:val="1F3B63"/>
-          <w:sz w:val="15"/>
-        </w:rPr>
-        <w:t>May 2026 - Sep 2026</w:t>
-      </w:r>
-    </w:p>
-    <w:p>
-      <w:pPr>
-        <w:tabs>
-          <w:tab w:pos="10656" w:val="right"/>
-        </w:tabs>
-        <w:spacing w:after="24" w:before="0"/>
-      </w:pPr>
-      <w:r>
-        <w:rPr>
-          <w:rFonts w:ascii="Georgia" w:hAnsi="Georgia"/>
-          <w:b/>
-          <w:i w:val="0"/>
-          <w:sz w:val="17"/>
-        </w:rPr>
-        <w:t>Program &amp; Administrative Assistant</w:t>
-      </w:r>
-      <w:r>
-        <w:rPr>
-          <w:rFonts w:ascii="Georgia" w:hAnsi="Georgia"/>
-          <w:b w:val="0"/>
-          <w:i w:val="0"/>
-          <w:color w:val="5A5A5A"/>
-          <w:sz w:val="17"/>
-        </w:rPr>
-        <w:t xml:space="preserve">   |   YMCA of Greater Toronto</w:t>
-      </w:r>
-      <w:r>
-        <w:rPr>
-          <w:rFonts w:ascii="Georgia" w:hAnsi="Georgia"/>
-          <w:b w:val="0"/>
-          <w:i w:val="0"/>
-          <w:sz w:val="17"/>
-        </w:rPr>
-        <w:tab/>
-      </w:r>
-      <w:r>
-        <w:rPr>
-          <w:rFonts w:ascii="Calibri" w:hAnsi="Calibri"/>
-          <w:b/>
-          <w:i w:val="0"/>
-          <w:color w:val="1F3B63"/>
-          <w:sz w:val="15"/>
-        </w:rPr>
-        <w:t>Dec 2024 - Jan 2026</w:t>
-      </w:r>
-    </w:p>
-    <w:p>
-      <w:pPr>
-        <w:tabs>
-          <w:tab w:pos="10656" w:val="right"/>
-        </w:tabs>
-        <w:spacing w:after="24" w:before="0"/>
-      </w:pPr>
-      <w:r>
-        <w:rPr>
-          <w:rFonts w:ascii="Georgia" w:hAnsi="Georgia"/>
-          <w:b/>
-          <w:i w:val="0"/>
-          <w:sz w:val="17"/>
-        </w:rPr>
-        <w:t>IT Support &amp; Lab Assistant, Volunteer</w:t>
-      </w:r>
-      <w:r>
-        <w:rPr>
-          <w:rFonts w:ascii="Georgia" w:hAnsi="Georgia"/>
-          <w:b w:val="0"/>
-          <w:i w:val="0"/>
-          <w:color w:val="5A5A5A"/>
-          <w:sz w:val="17"/>
-        </w:rPr>
-        <w:t xml:space="preserve">   |   Toronto Public Library</w:t>
-      </w:r>
-      <w:r>
-        <w:rPr>
-          <w:rFonts w:ascii="Georgia" w:hAnsi="Georgia"/>
-          <w:b w:val="0"/>
-          <w:i w:val="0"/>
-          <w:sz w:val="17"/>
-        </w:rPr>
-        <w:tab/>
-      </w:r>
-      <w:r>
-        <w:rPr>
-          <w:rFonts w:ascii="Calibri" w:hAnsi="Calibri"/>
-          <w:b/>
-          <w:i w:val="0"/>
-          <w:color w:val="1F3B63"/>
-          <w:sz w:val="15"/>
-        </w:rPr>
-        <w:t>Mar 2023 - Sep 2023</w:t>
-      </w:r>
-    </w:p>
     <w:sectPr>
       <w:pgSz w:w="12240" w:h="15840"/>
-      <w:pgMar w:top="576" w:right="792" w:bottom="576" w:left="792" w:header="720" w:footer="720" w:gutter="0"/>
+      <w:pgMar w:top="518" w:right="749" w:bottom="518" w:left="749" w:header="720" w:footer="720" w:gutter="0"/>
       <w:cols w:space="720"/>
       <w:docGrid w:linePitch="360"/>
     </w:sectPr>
@@ -1641,11 +1368,11 @@
     <w:qFormat/>
     <w:rsid w:val="00FC693F"/>
     <w:pPr>
-      <w:spacing w:after="0" w:before="0" w:line="254" w:lineRule="auto"/>
+      <w:spacing w:after="0" w:before="0"/>
     </w:pPr>
     <w:rPr>
-      <w:rFonts w:ascii="Georgia" w:hAnsi="Georgia"/>
-      <w:sz w:val="17"/>
+      <w:rFonts w:ascii="Calibri" w:hAnsi="Calibri"/>
+      <w:sz w:val="18"/>
     </w:rPr>
   </w:style>
   <w:style w:type="paragraph" w:styleId="Header">

</xml_diff>